<commit_message>
Polish investor TLDR and live metrics
</commit_message>
<xml_diff>
--- a/Veristake_Whitepaper_v2.docx
+++ b/Veristake_Whitepaper_v2.docx
@@ -83,7 +83,7 @@
                 <w:color w:val="0B2545"/>
                 <w:sz w:val="21"/>
               </w:rPr>
-              <w:t>Current thesis</w:t>
+              <w:t>Investor TLDR</w:t>
             </w:r>
           </w:p>
           <w:p>
@@ -91,7 +91,7 @@
               <w:spacing w:after="40"/>
             </w:pPr>
             <w:r>
-              <w:t>Veristake is not an insurer. It is a verification protocol layer that licensed carriers can plug into their claims pipeline.</w:t>
+              <w:t>Veristake is the verification layer for disputed insurance claims. Health and auto carriers keep underwriting authority and reserves, while Veristake routes contested claim packets to credentialed verifiers who stake capital, build reputation, and can be penalized for reckless decisions.</w:t>
             </w:r>
           </w:p>
           <w:p>
@@ -99,7 +99,7 @@
               <w:spacing w:after="40"/>
             </w:pPr>
             <w:r>
-              <w:t>The carrier keeps underwriting authority, policyholder liability, pricing, and payout reserves. Veristake supplies an economically accountable verifier network, auditable decisions, reputation, and slashing.</w:t>
+              <w:t>The result is faster, auditable, bias-resistant claim resolution without making Veristake an insurer.</w:t>
             </w:r>
           </w:p>
         </w:tc>

</xml_diff>

<commit_message>
Clarify disputed-claim verification model
</commit_message>
<xml_diff>
--- a/Veristake_Whitepaper_v2.docx
+++ b/Veristake_Whitepaper_v2.docx
@@ -128,7 +128,7 @@
         <w:spacing w:after="140" w:line="259" w:lineRule="auto"/>
       </w:pPr>
       <w:r>
-        <w:t>Veristake is a protocol layer for insurance claim verification. It is designed for licensed health and auto carriers that need outside adjudication capacity, bias-resistant review, and an auditable trail without handing underwriting authority to a crypto-native insurance product.</w:t>
+        <w:t>Veristake is a disputed-claim verification protocol layer for licensed health and auto carriers. It is designed for cases where trust breaks down: denied appeals, delayed payouts, complex evidence packets, suspected fraud, and other high-friction claims that need outside adjudication capacity, bias-resistant review, and an auditable trail without handing underwriting authority to a crypto-native insurance product.</w:t>
       </w:r>
     </w:p>
     <w:p>
@@ -144,7 +144,7 @@
         <w:spacing w:after="140" w:line="259" w:lineRule="auto"/>
       </w:pPr>
       <w:r>
-        <w:t>The core mechanism is simple. Verifiers put VST at risk, review structured claim packets, commit and reveal votes, and build a reputation history. Accurate review is rewarded; provably wrong or reckless review can be slashed. This turns claim review from a closed insurer-controlled process into an accountable verifier market.</w:t>
+        <w:t>The core mechanism is simple. Credentialed verifiers put VST at risk, review structured claim packets, commit and reveal votes, and build a reputation history. Accurate review is rewarded; provably wrong or reckless review can be slashed. But Veristake is not raw majority rule: verifier influence should reflect credential scope, historical accuracy, reputation, stake, and case fit, with appeal and arbiter correction for hard cases.</w:t>
       </w:r>
     </w:p>
     <w:p>
@@ -160,6 +160,12 @@
       </w:r>
       <w:r>
         <w:t>Health and auto are the only launch domains in the current product.</w:t>
+      </w:r>
+    </w:p>
+    <w:p>
+      <w:pPr/>
+      <w:r>
+        <w:t>• Veristake is not intended to process every routine claim; the first wedge is disputed, high-friction, or fraud-sensitive claims where external review has high value density.</w:t>
       </w:r>
     </w:p>
     <w:p>
@@ -1174,6 +1180,38 @@
       </w:r>
       <w:r>
         <w:t>The audit trail can support internal quality review, regulator response, reinsurer reporting, and broker transparency.</w:t>
+      </w:r>
+    </w:p>
+    <w:p>
+      <w:pPr>
+        <w:pStyle w:val="Heading2"/>
+      </w:pPr>
+      <w:r>
+        <w:t>2.2 Why Disputed Claims First</w:t>
+      </w:r>
+    </w:p>
+    <w:p>
+      <w:pPr/>
+      <w:r>
+        <w:t>Veristake should not sit in front of every claim. Routine, low-dollar, low-dispute claims should continue moving through carrier systems, automation, and ordinary adjuster workflows. External verifier review has a cost, so it belongs where the incremental trust, auditability, and fraud-control value is highest.</w:t>
+      </w:r>
+    </w:p>
+    <w:p>
+      <w:pPr/>
+      <w:r>
+        <w:t>• Cost efficiency: outside review is reserved for appeals, complex evidence packets, suspected fraud, delayed payouts, or large disputes rather than commodity processing.</w:t>
+      </w:r>
+    </w:p>
+    <w:p>
+      <w:pPr/>
+      <w:r>
+        <w:t>• Regulatory positioning: Veristake remains a verification layer inside a licensed carrier pipeline, not a TPA, claims core, or insurer substitute.</w:t>
+      </w:r>
+    </w:p>
+    <w:p>
+      <w:pPr/>
+      <w:r>
+        <w:t>• Value density: disputed claims are where claimants distrust carrier judgment and carriers need independent evidence review without surrendering reserves or policy authority.</w:t>
       </w:r>
     </w:p>
     <w:p>
@@ -1555,13 +1593,7 @@
         <w:ind w:left="346" w:hanging="202"/>
       </w:pPr>
       <w:r>
-        <w:rPr>
-          <w:color w:val="2563EB"/>
-        </w:rPr>
-        <w:t xml:space="preserve">• </w:t>
-      </w:r>
-      <w:r>
-        <w:t>Claimant submits structured metadata to ClaimRegistry.</w:t>
+        <w:t>• Carrier or claimant routes a disputed, high-friction, or fraud-sensitive claim packet to ClaimRegistry.</w:t>
       </w:r>
     </w:p>
     <w:p>
@@ -2344,6 +2376,32 @@
       </w:pPr>
       <w:r>
         <w:t>Contrarian rewards are central to the design. Veristake should not punish a reviewer for being in the minority if the minority is ultimately right. The goal is not blind consensus. The goal is accountable accuracy.</w:t>
+      </w:r>
+    </w:p>
+    <w:p>
+      <w:pPr>
+        <w:pStyle w:val="Heading2"/>
+      </w:pPr>
+      <w:r>
+        <w:t>5.4 Accuracy Is Not Raw Majority Rule</w:t>
+      </w:r>
+    </w:p>
+    <w:p>
+      <w:pPr/>
+      <w:r>
+        <w:t>A verifier market only works if it resists herd mentality. Veristake therefore should not be understood as community arbitration where the largest group automatically determines truth. The protocol needs a professional weighting model: credential scope, domain relevance, historical accuracy, reputation, stake at risk, and conflict signals should all affect influence.</w:t>
+      </w:r>
+    </w:p>
+    <w:p>
+      <w:pPr/>
+      <w:r>
+        <w:t>Economic incentives are necessary but not sufficient. Stake and slashing make reckless review costly, but they do not by themselves establish medical necessity, collision causation, fraud, or policy interpretation. Accuracy also depends on evidence standards, verifier credentialing, calibrated reputation, appeal rights, and, for hard cases, arbiter-panel correction.</w:t>
+      </w:r>
+    </w:p>
+    <w:p>
+      <w:pPr/>
+      <w:r>
+        <w:t>This is why honest dissent should be protected. A minority verifier who is later vindicated should be eligible for contrarian rewards, while a verifier who follows the majority into a clearly wrong outcome should still face reputation loss or slashing if the error is reckless and out of tolerance.</w:t>
       </w:r>
     </w:p>
     <w:p>
@@ -4370,6 +4428,18 @@
       </w:pPr>
       <w:r>
         <w:t>No. Veristake is software infrastructure for verification. Licensed carriers keep policies, reserves, underwriting authority, and legal obligations.</w:t>
+      </w:r>
+    </w:p>
+    <w:p>
+      <w:pPr/>
+      <w:r>
+        <w:t>Why not submit every claim?</w:t>
+      </w:r>
+    </w:p>
+    <w:p>
+      <w:pPr/>
+      <w:r>
+        <w:t>Because most claims are routine, low-friction, and already well suited to existing carrier systems. Veristake is designed for disputed appeals, large or delayed payouts, complex evidence, suspected fraud, and grey-area cases where independent review creates more value than it costs.</w:t>
       </w:r>
     </w:p>
     <w:p>

</xml_diff>

<commit_message>
Focus Veristake on carrier verification wedge
</commit_message>
<xml_diff>
--- a/Veristake_Whitepaper_v2.docx
+++ b/Veristake_Whitepaper_v2.docx
@@ -74,32 +74,12 @@
             <w:shd w:fill="EAF2FF"/>
           </w:tcPr>
           <w:p>
-            <w:pPr>
-              <w:spacing w:after="60"/>
-            </w:pPr>
-            <w:r>
-              <w:rPr>
-                <w:b/>
-                <w:color w:val="0B2545"/>
-                <w:sz w:val="21"/>
-              </w:rPr>
-              <w:t>Investor TLDR</w:t>
-            </w:r>
-          </w:p>
-          <w:p>
-            <w:pPr>
-              <w:spacing w:after="40"/>
-            </w:pPr>
-            <w:r>
-              <w:t>Veristake is the verification layer for disputed insurance claims. Health and auto carriers keep underwriting authority and reserves, while Veristake routes contested claim packets to credentialed verifiers who stake capital, build reputation, and can be penalized for reckless decisions.</w:t>
-            </w:r>
-          </w:p>
-          <w:p>
-            <w:pPr>
-              <w:spacing w:after="40"/>
-            </w:pPr>
-            <w:r>
-              <w:t>The result is faster, auditable, bias-resistant claim resolution without making Veristake an insurer.</w:t>
+            <w:r>
+              <w:t>Carrier TLDR</w:t>
+              <w:br/>
+              <w:t>Veristake is the carrier-facing verification layer for disputed insurance claims. Health and auto carriers keep underwriting authority, policyholder relationships, compliance obligations, and reserves, while Veristake routes carrier-selected claim packets to credentialed reviewers who stake capital, build reputation, and can be penalized for reckless decisions.</w:t>
+              <w:br/>
+              <w:t>The result is faster, auditable, bias-resistant second-look review without making Veristake an insurer, TPA, or consumer claims service.</w:t>
             </w:r>
           </w:p>
         </w:tc>
@@ -128,7 +108,7 @@
         <w:spacing w:after="140" w:line="259" w:lineRule="auto"/>
       </w:pPr>
       <w:r>
-        <w:t>Veristake is a disputed-claim verification protocol layer for licensed health and auto carriers. It is designed for cases where trust breaks down: denied appeals, delayed payouts, complex evidence packets, suspected fraud, and other high-friction claims that need outside adjudication capacity, bias-resistant review, and an auditable trail without handing underwriting authority to a crypto-native insurance product.</w:t>
+        <w:t>Veristake is a disputed-claim verification protocol layer for licensed health and auto carriers. The commercial wedge is carrier-routed second-look review: denied appeals, delayed payouts, complex evidence packets, suspected fraud, and other high-friction claims that need outside adjudication capacity, bias-resistant review, and an auditable trail without handing underwriting authority to a crypto-native insurance product.</w:t>
       </w:r>
     </w:p>
     <w:p>
@@ -136,7 +116,7 @@
         <w:spacing w:after="140" w:line="259" w:lineRule="auto"/>
       </w:pPr>
       <w:r>
-        <w:t>The final Phase 2 product now demonstrates this end-to-end: a public landing page for non-crypto insurance executives, a live Base Sepolia dashboard reading production-grade testnet contracts, and a no-wallet demo surface where a visitor can experience claimant, carrier, and verifier flows in minutes.</w:t>
+        <w:t>The final Phase 2 product now demonstrates this end-to-end: a public landing page for non-crypto insurance executives, a live Base Sepolia dashboard reading production-grade testnet contracts, and a no-wallet demo surface showing three views of one carrier workflow: carrier onboarding, dispute intake, and verifier review.</w:t>
       </w:r>
     </w:p>
     <w:p>
@@ -165,7 +145,7 @@
     <w:p>
       <w:pPr/>
       <w:r>
-        <w:t>• Veristake is not intended to process every routine claim; the first wedge is disputed, high-friction, or fraud-sensitive claims where external review has high value density.</w:t>
+        <w:t>• Veristake is not intended to process every routine claim or operate as a consumer claims service; the wedge is carrier-routed, high-friction, or fraud-sensitive claims where external review has high value density.</w:t>
       </w:r>
     </w:p>
     <w:p>
@@ -1053,16 +1033,8 @@
             <w:vAlign w:val="center"/>
           </w:tcPr>
           <w:p>
-            <w:pPr>
-              <w:spacing w:after="0"/>
-            </w:pPr>
-            <w:r/>
-            <w:r>
-              <w:rPr>
-                <w:b w:val="0"/>
-                <w:sz w:val="18"/>
-              </w:rPr>
-              <w:t>Arrive, understand, try a no-wallet demo, watch a claim resolve, and leave with an outcome that can be shown internally.</w:t>
+            <w:r>
+              <w:t>Arrive, understand, try a no-wallet carrier workflow, watch a carrier-routed dispute resolve, and leave with an outcome that can be shown internally.</w:t>
             </w:r>
           </w:p>
         </w:tc>
@@ -1211,7 +1183,7 @@
     <w:p>
       <w:pPr/>
       <w:r>
-        <w:t>• Value density: disputed claims are where claimants distrust carrier judgment and carriers need independent evidence review without surrendering reserves or policy authority.</w:t>
+        <w:t>• Value density: disputed claims are where members may distrust carrier judgment and carriers need independent evidence review without surrendering reserves or policy authority.</w:t>
       </w:r>
     </w:p>
     <w:p>
@@ -1433,16 +1405,8 @@
             <w:vAlign w:val="center"/>
           </w:tcPr>
           <w:p>
-            <w:pPr>
-              <w:spacing w:after="0"/>
-            </w:pPr>
-            <w:r/>
-            <w:r>
-              <w:rPr>
-                <w:b w:val="0"/>
-                <w:sz w:val="18"/>
-              </w:rPr>
-              <w:t>Narrated 90-second walkthrough video with poster art and captions.</w:t>
+            <w:r>
+              <w:t>Narrated carrier-wedge walkthrough video with poster art and no subtitles.</w:t>
             </w:r>
           </w:p>
         </w:tc>
@@ -1593,7 +1557,7 @@
         <w:ind w:left="346" w:hanging="202"/>
       </w:pPr>
       <w:r>
-        <w:t>• Carrier or claimant routes a disputed, high-friction, or fraud-sensitive claim packet to ClaimRegistry.</w:t>
+        <w:t>• Carrier routes a disputed, high-friction, or fraud-sensitive claim packet to ClaimRegistry through a configured intake path.</w:t>
       </w:r>
     </w:p>
     <w:p>
@@ -2421,7 +2385,7 @@
         <w:spacing w:after="140" w:line="259" w:lineRule="auto"/>
       </w:pPr>
       <w:r>
-        <w:t>The demo is built for insurance executives who do not want a wallet, testnet ETH, seed phrases, or token onboarding. The target path is: understand the value proposition, pick a persona, see a claim packet, watch verifier activity, and finish with a visible resolution.</w:t>
+        <w:t>The demo is built for insurance executives who do not want a wallet, testnet ETH, seed phrases, or token onboarding. The target path is: understand the carrier value proposition, see carrier onboarding, route a carrier-selected dispute packet, watch verifier activity, and finish with a visible resolution.</w:t>
       </w:r>
     </w:p>
     <w:tbl>
@@ -2510,17 +2474,8 @@
             <w:vAlign w:val="center"/>
           </w:tcPr>
           <w:p>
-            <w:pPr>
-              <w:spacing w:after="0"/>
-            </w:pPr>
-            <w:r/>
-            <w:r>
-              <w:rPr>
-                <w:b/>
-                <w:color w:val="166534"/>
-                <w:sz w:val="18"/>
-              </w:rPr>
-              <w:t>Health claimant</w:t>
+            <w:r>
+              <w:t>Health dispute intake</w:t>
             </w:r>
           </w:p>
         </w:tc>
@@ -2550,16 +2505,8 @@
             <w:vAlign w:val="center"/>
           </w:tcPr>
           <w:p>
-            <w:pPr>
-              <w:spacing w:after="0"/>
-            </w:pPr>
-            <w:r/>
-            <w:r>
-              <w:rPr>
-                <w:b w:val="0"/>
-                <w:sz w:val="18"/>
-              </w:rPr>
-              <w:t>$4,820 chest-pain ER visit denied as not medically necessary; verifier pool approves 4-1 and payout releases from carrier reserve.</w:t>
+            <w:r>
+              <w:t>$4,820 chest-pain ER visit routed by the carrier after denial as not medically necessary; verifier pool approves 4-1 and payout releases from carrier reserve.</w:t>
             </w:r>
           </w:p>
         </w:tc>
@@ -2632,17 +2579,8 @@
             <w:vAlign w:val="center"/>
           </w:tcPr>
           <w:p>
-            <w:pPr>
-              <w:spacing w:after="0"/>
-            </w:pPr>
-            <w:r/>
-            <w:r>
-              <w:rPr>
-                <w:b/>
-                <w:color w:val="166534"/>
-                <w:sz w:val="18"/>
-              </w:rPr>
-              <w:t>Auto claimant</w:t>
+            <w:r>
+              <w:t>Auto dispute intake</w:t>
             </w:r>
           </w:p>
         </w:tc>
@@ -2672,16 +2610,8 @@
             <w:vAlign w:val="center"/>
           </w:tcPr>
           <w:p>
-            <w:pPr>
-              <w:spacing w:after="0"/>
-            </w:pPr>
-            <w:r/>
-            <w:r>
-              <w:rPr>
-                <w:b w:val="0"/>
-                <w:sz w:val="18"/>
-              </w:rPr>
-              <w:t>$7,140 repair estimate vs. $3,200 insurer offer; verifier median resolves at a partial $6,800 payout.</w:t>
+            <w:r>
+              <w:t>$7,140 repair estimate vs. $3,200 insurer offer; carrier routes the dispute and verifier median resolves at a partial $6,800 payout.</w:t>
             </w:r>
           </w:p>
         </w:tc>
@@ -2815,11 +2745,7 @@
         <w:pStyle w:val="Heading2"/>
       </w:pPr>
       <w:r>
-        <w:rPr>
-          <w:color w:val="0B2545"/>
-          <w:sz w:val="26"/>
-        </w:rPr>
-        <w:t>6.1 Persona Flows</w:t>
+        <w:t>6.1 Workflow Views</w:t>
       </w:r>
     </w:p>
     <w:p>
@@ -2843,13 +2769,7 @@
         <w:ind w:left="346" w:hanging="202"/>
       </w:pPr>
       <w:r>
-        <w:rPr>
-          <w:color w:val="2563EB"/>
-        </w:rPr>
-        <w:t xml:space="preserve">• </w:t>
-      </w:r>
-      <w:r>
-        <w:t>Claimant: submit a health ER denial appeal or auto collision dispute and watch the resolution panel update.</w:t>
+        <w:t>• Dispute intake: route a health ER denial appeal or auto collision dispute selected by the carrier and watch the resolution panel update.</w:t>
       </w:r>
     </w:p>
     <w:p>
@@ -4102,16 +4022,8 @@
             <w:vAlign w:val="center"/>
           </w:tcPr>
           <w:p>
-            <w:pPr>
-              <w:spacing w:after="0"/>
-            </w:pPr>
-            <w:r/>
-            <w:r>
-              <w:rPr>
-                <w:b w:val="0"/>
-                <w:sz w:val="18"/>
-              </w:rPr>
-              <w:t>Next.js site, sourced landing page, three persona flows, screenshots, narrated walkthrough, legal/footer/metadata polish.</w:t>
+            <w:r>
+              <w:t>Next.js site, sourced landing page, three carrier-workflow views, screenshots, narrated walkthrough, legal/footer/metadata polish.</w:t>
             </w:r>
           </w:p>
         </w:tc>
@@ -4425,7 +4337,7 @@
     <w:p>
       <w:pPr/>
       <w:r>
-        <w:t>Why not submit every claim?</w:t>
+        <w:t>Why not process every claim?</w:t>
       </w:r>
     </w:p>
     <w:p>

</xml_diff>

<commit_message>
Improve walkthrough audio and sandbox status
</commit_message>
<xml_diff>
--- a/Veristake_Whitepaper_v2.docx
+++ b/Veristake_Whitepaper_v2.docx
@@ -74,12 +74,40 @@
             <w:shd w:fill="EAF2FF"/>
           </w:tcPr>
           <w:p>
-            <w:r>
-              <w:t>Carrier TLDR</w:t>
-              <w:br/>
-              <w:t>Veristake is the carrier-facing verification layer for disputed insurance claims. Health and auto carriers keep underwriting authority, policyholder relationships, compliance obligations, and reserves, while Veristake routes carrier-selected claim packets to credentialed reviewers who stake capital, build reputation, and can be penalized for reckless decisions.</w:t>
-              <w:br/>
-              <w:t>The result is faster, auditable, bias-resistant second-look review without making Veristake an insurer, TPA, or consumer claims service.</w:t>
+            <w:pPr>
+              <w:spacing w:after="120"/>
+            </w:pPr>
+            <w:r>
+              <w:rPr>
+                <w:b/>
+                <w:color w:val="0B2545"/>
+                <w:sz w:val="24"/>
+              </w:rPr>
+              <w:t>Investor TLDR</w:t>
+            </w:r>
+          </w:p>
+          <w:p>
+            <w:pPr>
+              <w:spacing w:after="80"/>
+            </w:pPr>
+            <w:r>
+              <w:rPr>
+                <w:color w:val="1F2937"/>
+                <w:sz w:val="21"/>
+              </w:rPr>
+              <w:t>Veristake is the verification layer for disputed insurance claims. Health and auto carriers keep underwriting authority and reserves, while Veristake routes contested claim packets to credentialed verifiers who stake capital, build reputation, and can be penalized for reckless decisions.</w:t>
+            </w:r>
+          </w:p>
+          <w:p>
+            <w:pPr>
+              <w:spacing w:after="80"/>
+            </w:pPr>
+            <w:r>
+              <w:rPr>
+                <w:color w:val="1F2937"/>
+                <w:sz w:val="21"/>
+              </w:rPr>
+              <w:t>The result is faster, auditable, bias-resistant claim resolution without making Veristake an insurer.</w:t>
             </w:r>
           </w:p>
         </w:tc>

</xml_diff>